<commit_message>
Update docs: SAD/Test Plan v1.1, traceability matrix, deviations, backlog status
</commit_message>
<xml_diff>
--- a/docs/SAD_Team1_SAMS.docx
+++ b/docs/SAD_Team1_SAMS.docx
@@ -37,11 +37,11 @@
       </w:pPr>
       <w:r>
         <w:br/>
-        <w:t>Version: 1.0</w:t>
+        <w:t>Version: 1.1</w:t>
         <w:br/>
         <w:t>Status: Draft</w:t>
         <w:br/>
-        <w:t>Date: 05-10-2026</w:t>
+        <w:t>Date: 29-10-2026</w:t>
         <w:br/>
         <w:br/>
         <w:t>Authors: Team 1</w:t>
@@ -364,6 +364,64 @@
                 <w:sz w:val="20"/>
               </w:rPr>
               <w:t>Initial version</w:t>
+            </w:r>
+          </w:p>
+        </w:tc>
+      </w:tr>
+      <w:tr>
+        <w:tc>
+          <w:tcPr>
+            <w:tcW w:type="dxa" w:w="1134"/>
+          </w:tcPr>
+          <w:p>
+            <w:r>
+              <w:rPr>
+                <w:b w:val="0"/>
+                <w:sz w:val="20"/>
+              </w:rPr>
+              <w:t>1.1</w:t>
+            </w:r>
+          </w:p>
+        </w:tc>
+        <w:tc>
+          <w:tcPr>
+            <w:tcW w:type="dxa" w:w="1701"/>
+          </w:tcPr>
+          <w:p>
+            <w:r>
+              <w:rPr>
+                <w:b w:val="0"/>
+                <w:sz w:val="20"/>
+              </w:rPr>
+              <w:t>29-10-2026</w:t>
+            </w:r>
+          </w:p>
+        </w:tc>
+        <w:tc>
+          <w:tcPr>
+            <w:tcW w:type="dxa" w:w="2268"/>
+          </w:tcPr>
+          <w:p>
+            <w:r>
+              <w:rPr>
+                <w:b w:val="0"/>
+                <w:sz w:val="20"/>
+              </w:rPr>
+              <w:t>Team 1</w:t>
+            </w:r>
+          </w:p>
+        </w:tc>
+        <w:tc>
+          <w:tcPr>
+            <w:tcW w:type="dxa" w:w="3969"/>
+          </w:tcPr>
+          <w:p>
+            <w:r>
+              <w:rPr>
+                <w:b w:val="0"/>
+                <w:sz w:val="20"/>
+              </w:rPr>
+              <w:t>Data model and API updated to match implementation</w:t>
             </w:r>
           </w:p>
         </w:tc>
@@ -2187,7 +2245,7 @@
                 <w:b w:val="0"/>
                 <w:sz w:val="20"/>
               </w:rPr>
-              <w:t>MySQL 8.0</w:t>
+              <w:t>MySQL 8.0 (SQLite for local testing and CI)</w:t>
             </w:r>
           </w:p>
         </w:tc>
@@ -2395,7 +2453,7 @@
                 <w:b w:val="0"/>
                 <w:sz w:val="20"/>
               </w:rPr>
-              <w:t>code, name, semester, faculty</w:t>
+              <w:t>code, name, semester</w:t>
             </w:r>
           </w:p>
         </w:tc>
@@ -2425,7 +2483,7 @@
                 <w:b w:val="0"/>
                 <w:sz w:val="20"/>
               </w:rPr>
-              <w:t>semester, section, department</w:t>
+              <w:t>department, semester, section, students</w:t>
             </w:r>
           </w:p>
         </w:tc>
@@ -2441,7 +2499,7 @@
                 <w:b w:val="0"/>
                 <w:sz w:val="20"/>
               </w:rPr>
-              <w:t>Enrollment</w:t>
+              <w:t>Teaching</w:t>
             </w:r>
           </w:p>
         </w:tc>
@@ -2455,7 +2513,7 @@
                 <w:b w:val="0"/>
                 <w:sz w:val="20"/>
               </w:rPr>
-              <w:t>student, class</w:t>
+              <w:t>faculty, subject, class_section (which faculty teaches what)</w:t>
             </w:r>
           </w:p>
         </w:tc>
@@ -2546,6 +2604,36 @@
                 <w:sz w:val="20"/>
               </w:rPr>
               <w:t>student, from_date, to_date, reason, status</w:t>
+            </w:r>
+          </w:p>
+        </w:tc>
+      </w:tr>
+      <w:tr>
+        <w:tc>
+          <w:tcPr>
+            <w:tcW w:type="dxa" w:w="2268"/>
+          </w:tcPr>
+          <w:p>
+            <w:r>
+              <w:rPr>
+                <w:b w:val="0"/>
+                <w:sz w:val="20"/>
+              </w:rPr>
+              <w:t>ShortageAlert</w:t>
+            </w:r>
+          </w:p>
+        </w:tc>
+        <w:tc>
+          <w:tcPr>
+            <w:tcW w:type="dxa" w:w="6803"/>
+          </w:tcPr>
+          <w:p>
+            <w:r>
+              <w:rPr>
+                <w:b w:val="0"/>
+                <w:sz w:val="20"/>
+              </w:rPr>
+              <w:t>student, subject, percent, sent_at (shortage mails sent)</w:t>
             </w:r>
           </w:p>
         </w:tc>
@@ -3666,7 +3754,7 @@
       <w:r>
         <w:drawing>
           <wp:inline xmlns:a="http://schemas.openxmlformats.org/drawingml/2006/main" xmlns:pic="http://schemas.openxmlformats.org/drawingml/2006/picture">
-            <wp:extent cx="5669280" cy="3998732"/>
+            <wp:extent cx="5669280" cy="3786678"/>
             <wp:docPr id="2" name="Picture 2"/>
             <wp:cNvGraphicFramePr>
               <a:graphicFrameLocks noChangeAspect="1"/>
@@ -3675,7 +3763,7 @@
               <a:graphicData uri="http://schemas.openxmlformats.org/drawingml/2006/picture">
                 <pic:pic>
                   <pic:nvPicPr>
-                    <pic:cNvPr id="0" name="seq1.png"/>
+                    <pic:cNvPr id="0" name="seq1b.png"/>
                     <pic:cNvPicPr/>
                   </pic:nvPicPr>
                   <pic:blipFill>
@@ -3687,7 +3775,7 @@
                   <pic:spPr>
                     <a:xfrm>
                       <a:off x="0" y="0"/>
-                      <a:ext cx="5669280" cy="3998732"/>
+                      <a:ext cx="5669280" cy="3786678"/>
                     </a:xfrm>
                     <a:prstGeom prst="rect"/>
                   </pic:spPr>
@@ -3713,7 +3801,7 @@
       <w:r>
         <w:drawing>
           <wp:inline xmlns:a="http://schemas.openxmlformats.org/drawingml/2006/main" xmlns:pic="http://schemas.openxmlformats.org/drawingml/2006/picture">
-            <wp:extent cx="5669280" cy="3952854"/>
+            <wp:extent cx="5669280" cy="3997569"/>
             <wp:docPr id="3" name="Picture 3"/>
             <wp:cNvGraphicFramePr>
               <a:graphicFrameLocks noChangeAspect="1"/>
@@ -3722,7 +3810,7 @@
               <a:graphicData uri="http://schemas.openxmlformats.org/drawingml/2006/picture">
                 <pic:pic>
                   <pic:nvPicPr>
-                    <pic:cNvPr id="0" name="seq2.png"/>
+                    <pic:cNvPr id="0" name="seq2b.png"/>
                     <pic:cNvPicPr/>
                   </pic:nvPicPr>
                   <pic:blipFill>
@@ -3734,7 +3822,7 @@
                   <pic:spPr>
                     <a:xfrm>
                       <a:off x="0" y="0"/>
-                      <a:ext cx="5669280" cy="3952854"/>
+                      <a:ext cx="5669280" cy="3997569"/>
                     </a:xfrm>
                     <a:prstGeom prst="rect"/>
                   </pic:spPr>
@@ -3906,7 +3994,7 @@
                 <w:b w:val="0"/>
                 <w:sz w:val="20"/>
               </w:rPr>
-              <w:t>subject_id, class_id, date, hour</w:t>
+              <w:t>teaching, date, hour</w:t>
             </w:r>
           </w:p>
         </w:tc>
@@ -3934,7 +4022,7 @@
                 <w:b w:val="0"/>
                 <w:sz w:val="20"/>
               </w:rPr>
-              <w:t>403 not your subject</w:t>
+              <w:t>not your class - not listed</w:t>
             </w:r>
           </w:p>
         </w:tc>
@@ -3978,7 +4066,7 @@
                 <w:b w:val="0"/>
                 <w:sz w:val="20"/>
               </w:rPr>
-              <w:t>subject_id, class_id, date, hour, absent_ids[]</w:t>
+              <w:t>teaching, date, hour, absent[]</w:t>
             </w:r>
           </w:p>
         </w:tc>
@@ -4006,7 +4094,7 @@
                 <w:b w:val="0"/>
                 <w:sz w:val="20"/>
               </w:rPr>
-              <w:t>400 already marked; 403 not your subject</w:t>
+              <w:t>"Attendance already marked"; future date</w:t>
             </w:r>
           </w:p>
         </w:tc>
@@ -4022,7 +4110,7 @@
                 <w:b w:val="0"/>
                 <w:sz w:val="20"/>
               </w:rPr>
-              <w:t>/attendance/&lt;id&gt;/edit/</w:t>
+              <w:t>/attendance/edit/</w:t>
             </w:r>
           </w:p>
         </w:tc>
@@ -4050,7 +4138,7 @@
                 <w:b w:val="0"/>
                 <w:sz w:val="20"/>
               </w:rPr>
-              <w:t>status</w:t>
+              <w:t>teaching, date, hour, status per student</w:t>
             </w:r>
           </w:p>
         </w:tc>
@@ -4078,7 +4166,7 @@
                 <w:b w:val="0"/>
                 <w:sz w:val="20"/>
               </w:rPr>
-              <w:t>403 more than 3 days old</w:t>
+              <w:t>more than 3 days old (faculty)</w:t>
             </w:r>
           </w:p>
         </w:tc>
@@ -4253,7 +4341,7 @@
                 <w:b w:val="0"/>
                 <w:sz w:val="20"/>
               </w:rPr>
-              <w:t>400 invalid dates</w:t>
+              <w:t>invalid / overlapping dates</w:t>
             </w:r>
           </w:p>
         </w:tc>
@@ -4341,7 +4429,79 @@
                 <w:b w:val="0"/>
                 <w:sz w:val="20"/>
               </w:rPr>
-              <w:t>/leaves/&lt;id&gt;/approve/</w:t>
+              <w:t>/leaves/my/</w:t>
+            </w:r>
+          </w:p>
+        </w:tc>
+        <w:tc>
+          <w:tcPr>
+            <w:tcW w:type="dxa" w:w="1134"/>
+          </w:tcPr>
+          <w:p>
+            <w:r>
+              <w:rPr>
+                <w:b w:val="0"/>
+                <w:sz w:val="20"/>
+              </w:rPr>
+              <w:t>GET</w:t>
+            </w:r>
+          </w:p>
+        </w:tc>
+        <w:tc>
+          <w:tcPr>
+            <w:tcW w:type="dxa" w:w="2268"/>
+          </w:tcPr>
+          <w:p>
+            <w:r>
+              <w:rPr>
+                <w:b w:val="0"/>
+                <w:sz w:val="20"/>
+              </w:rPr>
+              <w:t>-</w:t>
+            </w:r>
+          </w:p>
+        </w:tc>
+        <w:tc>
+          <w:tcPr>
+            <w:tcW w:type="dxa" w:w="1928"/>
+          </w:tcPr>
+          <w:p>
+            <w:r>
+              <w:rPr>
+                <w:b w:val="0"/>
+                <w:sz w:val="20"/>
+              </w:rPr>
+              <w:t>Own leave requests</w:t>
+            </w:r>
+          </w:p>
+        </w:tc>
+        <w:tc>
+          <w:tcPr>
+            <w:tcW w:type="dxa" w:w="1701"/>
+          </w:tcPr>
+          <w:p>
+            <w:r>
+              <w:rPr>
+                <w:b w:val="0"/>
+                <w:sz w:val="20"/>
+              </w:rPr>
+              <w:t>403 not student</w:t>
+            </w:r>
+          </w:p>
+        </w:tc>
+      </w:tr>
+      <w:tr>
+        <w:tc>
+          <w:tcPr>
+            <w:tcW w:type="dxa" w:w="2041"/>
+          </w:tcPr>
+          <w:p>
+            <w:r>
+              <w:rPr>
+                <w:b w:val="0"/>
+                <w:sz w:val="20"/>
+              </w:rPr>
+              <w:t>/leaves/&lt;id&gt;/decide/</w:t>
             </w:r>
           </w:p>
         </w:tc>
@@ -4588,7 +4748,7 @@
                 <w:b w:val="0"/>
                 <w:sz w:val="20"/>
               </w:rPr>
-              <w:t>/reports/generate/</w:t>
+              <w:t>/reports/class/</w:t>
             </w:r>
           </w:p>
         </w:tc>
@@ -4616,7 +4776,7 @@
                 <w:b w:val="0"/>
                 <w:sz w:val="20"/>
               </w:rPr>
-              <w:t>class_id, subject_id, from, to, format (pdf/xlsx)</w:t>
+              <w:t>teaching, start, end</w:t>
             </w:r>
           </w:p>
         </w:tc>
@@ -4630,7 +4790,7 @@
                 <w:b w:val="0"/>
                 <w:sz w:val="20"/>
               </w:rPr>
-              <w:t>File download</w:t>
+              <w:t>Class report with %</w:t>
             </w:r>
           </w:p>
         </w:tc>
@@ -4644,7 +4804,254 @@
                 <w:b w:val="0"/>
                 <w:sz w:val="20"/>
               </w:rPr>
-              <w:t>400 invalid dates</w:t>
+              <w:t>invalid dates; 403 student</w:t>
+            </w:r>
+          </w:p>
+        </w:tc>
+      </w:tr>
+      <w:tr>
+        <w:tc>
+          <w:tcPr>
+            <w:tcW w:type="dxa" w:w="2041"/>
+          </w:tcPr>
+          <w:p>
+            <w:r>
+              <w:rPr>
+                <w:b w:val="0"/>
+                <w:sz w:val="20"/>
+              </w:rPr>
+              <w:t>/reports/shortage/</w:t>
+            </w:r>
+          </w:p>
+        </w:tc>
+        <w:tc>
+          <w:tcPr>
+            <w:tcW w:type="dxa" w:w="1134"/>
+          </w:tcPr>
+          <w:p>
+            <w:r>
+              <w:rPr>
+                <w:b w:val="0"/>
+                <w:sz w:val="20"/>
+              </w:rPr>
+              <w:t>GET</w:t>
+            </w:r>
+          </w:p>
+        </w:tc>
+        <w:tc>
+          <w:tcPr>
+            <w:tcW w:type="dxa" w:w="2268"/>
+          </w:tcPr>
+          <w:p>
+            <w:r>
+              <w:rPr>
+                <w:b w:val="0"/>
+                <w:sz w:val="20"/>
+              </w:rPr>
+              <w:t>teaching (optional)</w:t>
+            </w:r>
+          </w:p>
+        </w:tc>
+        <w:tc>
+          <w:tcPr>
+            <w:tcW w:type="dxa" w:w="1928"/>
+          </w:tcPr>
+          <w:p>
+            <w:r>
+              <w:rPr>
+                <w:b w:val="0"/>
+                <w:sz w:val="20"/>
+              </w:rPr>
+              <w:t>Students below 75%</w:t>
+            </w:r>
+          </w:p>
+        </w:tc>
+        <w:tc>
+          <w:tcPr>
+            <w:tcW w:type="dxa" w:w="1701"/>
+          </w:tcPr>
+          <w:p>
+            <w:r>
+              <w:rPr>
+                <w:b w:val="0"/>
+                <w:sz w:val="20"/>
+              </w:rPr>
+              <w:t>403 student</w:t>
+            </w:r>
+          </w:p>
+        </w:tc>
+      </w:tr>
+    </w:tbl>
+    <w:p/>
+    <w:p>
+      <w:r>
+        <w:rPr>
+          <w:b/>
+        </w:rPr>
+        <w:t>Accounts component</w:t>
+      </w:r>
+    </w:p>
+    <w:tbl>
+      <w:tblPr>
+        <w:tblW w:type="auto" w:w="0"/>
+        <w:tblLayout w:type="fixed"/>
+        <w:tblLook w:firstColumn="1" w:firstRow="1" w:lastColumn="0" w:lastRow="0" w:noHBand="0" w:noVBand="1" w:val="04A0"/>
+        <w:tblBorders>
+          <w:top w:val="single" w:sz="4" w:space="0" w:color="000000"/>
+          <w:left w:val="single" w:sz="4" w:space="0" w:color="000000"/>
+          <w:bottom w:val="single" w:sz="4" w:space="0" w:color="000000"/>
+          <w:right w:val="single" w:sz="4" w:space="0" w:color="000000"/>
+          <w:insideH w:val="single" w:sz="4" w:space="0" w:color="000000"/>
+          <w:insideV w:val="single" w:sz="4" w:space="0" w:color="000000"/>
+        </w:tblBorders>
+      </w:tblPr>
+      <w:tblGrid>
+        <w:gridCol w:w="2041"/>
+        <w:gridCol w:w="1134"/>
+        <w:gridCol w:w="2268"/>
+        <w:gridCol w:w="1928"/>
+        <w:gridCol w:w="1701"/>
+      </w:tblGrid>
+      <w:tr>
+        <w:tc>
+          <w:tcPr>
+            <w:tcW w:type="dxa" w:w="2041"/>
+          </w:tcPr>
+          <w:p>
+            <w:r>
+              <w:rPr>
+                <w:b/>
+                <w:sz w:val="20"/>
+              </w:rPr>
+              <w:t>Endpoint</w:t>
+            </w:r>
+          </w:p>
+        </w:tc>
+        <w:tc>
+          <w:tcPr>
+            <w:tcW w:type="dxa" w:w="1134"/>
+          </w:tcPr>
+          <w:p>
+            <w:r>
+              <w:rPr>
+                <w:b/>
+                <w:sz w:val="20"/>
+              </w:rPr>
+              <w:t>Type</w:t>
+            </w:r>
+          </w:p>
+        </w:tc>
+        <w:tc>
+          <w:tcPr>
+            <w:tcW w:type="dxa" w:w="2268"/>
+          </w:tcPr>
+          <w:p>
+            <w:r>
+              <w:rPr>
+                <w:b/>
+                <w:sz w:val="20"/>
+              </w:rPr>
+              <w:t>Request</w:t>
+            </w:r>
+          </w:p>
+        </w:tc>
+        <w:tc>
+          <w:tcPr>
+            <w:tcW w:type="dxa" w:w="1928"/>
+          </w:tcPr>
+          <w:p>
+            <w:r>
+              <w:rPr>
+                <w:b/>
+                <w:sz w:val="20"/>
+              </w:rPr>
+              <w:t>Response</w:t>
+            </w:r>
+          </w:p>
+        </w:tc>
+        <w:tc>
+          <w:tcPr>
+            <w:tcW w:type="dxa" w:w="1701"/>
+          </w:tcPr>
+          <w:p>
+            <w:r>
+              <w:rPr>
+                <w:b/>
+                <w:sz w:val="20"/>
+              </w:rPr>
+              <w:t>Errors</w:t>
+            </w:r>
+          </w:p>
+        </w:tc>
+      </w:tr>
+      <w:tr>
+        <w:tc>
+          <w:tcPr>
+            <w:tcW w:type="dxa" w:w="2041"/>
+          </w:tcPr>
+          <w:p>
+            <w:r>
+              <w:rPr>
+                <w:b w:val="0"/>
+                <w:sz w:val="20"/>
+              </w:rPr>
+              <w:t>/accounts/students/upload/</w:t>
+            </w:r>
+          </w:p>
+        </w:tc>
+        <w:tc>
+          <w:tcPr>
+            <w:tcW w:type="dxa" w:w="1134"/>
+          </w:tcPr>
+          <w:p>
+            <w:r>
+              <w:rPr>
+                <w:b w:val="0"/>
+                <w:sz w:val="20"/>
+              </w:rPr>
+              <w:t>POST</w:t>
+            </w:r>
+          </w:p>
+        </w:tc>
+        <w:tc>
+          <w:tcPr>
+            <w:tcW w:type="dxa" w:w="2268"/>
+          </w:tcPr>
+          <w:p>
+            <w:r>
+              <w:rPr>
+                <w:b w:val="0"/>
+                <w:sz w:val="20"/>
+              </w:rPr>
+              <w:t>.xlsx file</w:t>
+            </w:r>
+          </w:p>
+        </w:tc>
+        <w:tc>
+          <w:tcPr>
+            <w:tcW w:type="dxa" w:w="1928"/>
+          </w:tcPr>
+          <w:p>
+            <w:r>
+              <w:rPr>
+                <w:b w:val="0"/>
+                <w:sz w:val="20"/>
+              </w:rPr>
+              <w:t>Rows added + rejected rows with reason</w:t>
+            </w:r>
+          </w:p>
+        </w:tc>
+        <w:tc>
+          <w:tcPr>
+            <w:tcW w:type="dxa" w:w="1701"/>
+          </w:tcPr>
+          <w:p>
+            <w:r>
+              <w:rPr>
+                <w:b w:val="0"/>
+                <w:sz w:val="20"/>
+              </w:rPr>
+              <w:t>wrong file / header; 403 not admin</w:t>
             </w:r>
           </w:p>
         </w:tc>

</xml_diff>

<commit_message>
Fix test count and model fields in docs
</commit_message>
<xml_diff>
--- a/docs/SAD_Team1_SAMS.docx
+++ b/docs/SAD_Team1_SAMS.docx
@@ -2423,7 +2423,7 @@
                 <w:b w:val="0"/>
                 <w:sz w:val="20"/>
               </w:rPr>
-              <w:t>id, username, password (hashed), name, email, role</w:t>
+              <w:t>id, username, password (hashed), name, email, role, srn, phone</w:t>
             </w:r>
           </w:p>
         </w:tc>
@@ -2543,7 +2543,7 @@
                 <w:b w:val="0"/>
                 <w:sz w:val="20"/>
               </w:rPr>
-              <w:t>student, subject, class, date, hour, status (P/A/L), marked_by</w:t>
+              <w:t>student, subject, class_section, date, hour, status (P/A/L), marked_by, marked_at</w:t>
             </w:r>
           </w:p>
         </w:tc>

</xml_diff>